<commit_message>
Faster multiple imputation, run in parallel, and save/load of imputed data
- miceFit: flat typed-array design matrices, ridge solve and donor search
  rewritten with the same arithmetic in the same order: results identical,
  2-2.5x faster on one core
- Larger jobs run the imputations in several workers at a time; each imputation
  is seeded on its own, so the merged result equals a single run (tested)
- Save imputed data / Load imputed data in Step 4: a session's imputations can be
  reused later; the file contains patient-level data and says so (ethics pack,
  HTML and Word, updated)

Co-Authored-By: Claude Opus 5.5 <noreply@anthropic.com>
</commit_message>
<xml_diff>
--- a/docs/ethics-committee-information-pack.docx
+++ b/docs/ethics-committee-information-pack.docx
@@ -1045,6 +1045,41 @@
             </w:pPr>
             <w:r>
               <w:t xml:space="preserve">Yes: these methods need training patients' predictor values, which the application states before the file is saved</w:t>
+            </w:r>
+          </w:p>
+        </w:tc>
+      </w:tr>
+      <w:tr>
+        <w:tc>
+          <w:tcPr/>
+          <w:p>
+            <w:pPr>
+              <w:pStyle w:val="Compact"/>
+            </w:pPr>
+            <w:r>
+              <w:t xml:space="preserve">Imputed data file (.json)</w:t>
+            </w:r>
+          </w:p>
+        </w:tc>
+        <w:tc>
+          <w:tcPr/>
+          <w:p>
+            <w:pPr>
+              <w:pStyle w:val="Compact"/>
+            </w:pPr>
+            <w:r>
+              <w:t xml:space="preserve">Researcher clicks “Save imputed data” (Step 4, multiple imputation)</w:t>
+            </w:r>
+          </w:p>
+        </w:tc>
+        <w:tc>
+          <w:tcPr/>
+          <w:p>
+            <w:pPr>
+              <w:pStyle w:val="Compact"/>
+            </w:pPr>
+            <w:r>
+              <w:t xml:space="preserve">Yes: every training patient's values with the missing ones filled in, to skip repeating the imputation in a later session. The file name includes “PATIENT-DATA” and the application states this when it is saved</w:t>
             </w:r>
           </w:p>
         </w:tc>

</xml_diff>

<commit_message>
MICE diagnostics and validity checks
- Convergence panel after training with MICE: mean imputed value per round for
  each imputation, with Gelman-Rubin R-hat (burn-in 2 rounds, warning above 1.3)
- MAR validity test: MICE recovers the true mean and correlation, 95% interval
  coverage reported; complete cases shown biased
- Reference check: pooled MICE estimates vs scikit-learn IterativeImputer
- README: PMM's small attenuation where donors are scarce documented
- TRIPOD and ethics pack state how folds and resamples were imputed

Co-Authored-By: Claude Opus 5.5 <noreply@anthropic.com>
</commit_message>
<xml_diff>
--- a/docs/ethics-committee-information-pack.docx
+++ b/docs/ethics-committee-information-pack.docx
@@ -348,7 +348,7 @@
               <w:pStyle w:val="Compact"/>
             </w:pPr>
             <w:r>
-              <w:t xml:space="preserve">66 automated comparisons against established statistical software (SciPy, scikit-learn, statsmodels, scikit-survival, pmsampsize), an equivalence benchmark against scikit-learn, PyTorch and imbalanced-learn, two open-source audit tools (Fairlearn, Deepchecks) and a suite of end-to-end and browser tests that run automatically on every change (section 6).</w:t>
+              <w:t xml:space="preserve">67 automated comparisons against established statistical software (SciPy, scikit-learn, statsmodels, scikit-survival, pmsampsize), including multiple imputation against scikit-learn, an equivalence benchmark against scikit-learn, PyTorch and imbalanced-learn, two open-source audit tools (Fairlearn, Deepchecks) and a suite of end-to-end and browser tests that run automatically on every change (section 6).</w:t>
             </w:r>
           </w:p>
         </w:tc>
@@ -782,6 +782,28 @@
       </w:r>
       <w:r>
         <w:t xml:space="preserve">Model and settings files loaded into the application are treated as untrusted: they are read as plain data only (a file cannot add program code), checked against the expected structure, and a model must predict a test patient correctly before anything is installed.</w:t>
+      </w:r>
+    </w:p>
+    <w:p>
+      <w:pPr>
+        <w:pStyle w:val="Compact"/>
+        <w:numPr>
+          <w:ilvl w:val="0"/>
+          <w:numId w:val="1004"/>
+        </w:numPr>
+      </w:pPr>
+      <w:r>
+        <w:rPr>
+          <w:b/>
+          <w:bCs/>
+        </w:rPr>
+        <w:t xml:space="preserve">Missing data.</w:t>
+      </w:r>
+      <w:r>
+        <w:t xml:space="preserve"> </w:t>
+      </w:r>
+      <w:r>
+        <w:t xml:space="preserve">One choice governs the analysis: single imputation, or multiple imputation (MICE), which is then used for the final models and repeated inside every cross-validation fold and bootstrap resample, always fitted without the outcome on the patients used for training. MICE is checked on simulated data against known true values and against scikit-learn, and a convergence panel is shown.</w:t>
       </w:r>
     </w:p>
     <w:p>
@@ -1685,7 +1707,7 @@
               <w:pStyle w:val="Compact"/>
             </w:pPr>
             <w:r>
-              <w:t xml:space="preserve">66 comparisons with SciPy, scikit-learn, statsmodels, scikit-survival and pmsampsize: data preparation, logistic regression and odds ratios, calibration slope and intercept, Platt and isotonic recalibration, DeLong test, precision-recall and decision curves, Rubin's rules, Cox model (Efron ties), C-index, Kaplan–Meier estimates with Greenwood confidence intervals, time-dependent AUC and Brier score, Riley sample size</w:t>
+              <w:t xml:space="preserve">67 comparisons with SciPy, scikit-learn, statsmodels, scikit-survival and pmsampsize: data preparation, logistic regression and odds ratios, calibration slope and intercept, Platt and isotonic recalibration, DeLong test, precision-recall and decision curves, Rubin's rules, Cox model (Efron ties), C-index, Kaplan–Meier estimates with Greenwood confidence intervals, time-dependent AUC and Brier score, Riley sample size</w:t>
             </w:r>
           </w:p>
         </w:tc>

</xml_diff>